<commit_message>
fix: change alert condition from OR to AND
</commit_message>
<xml_diff>
--- a/ai_14/davyd_bahatskyi/epic_2/epic_2_report_davyd_bahatskyi.docx
+++ b/ai_14/davyd_bahatskyi/epic_2/epic_2_report_davyd_bahatskyi.docx
@@ -1576,23 +1576,6 @@
           <w:lang w:val="uk-UA"/>
         </w:rPr>
       </w:r>
-    </w:p>
-    <w:p>
-      <w:pPr>
-        <w:pStyle w:val="1000"/>
-        <w:pBdr/>
-        <w:spacing w:after="0" w:before="240" w:line="276" w:lineRule="auto"/>
-        <w:ind/>
-        <w:jc w:val="both"/>
-        <w:rPr>
-          <w:rFonts w:ascii="Times New Roman" w:hAnsi="Times New Roman" w:eastAsia="Times New Roman" w:cs="Times New Roman"/>
-          <w:b/>
-          <w:bCs/>
-          <w:sz w:val="32"/>
-          <w:szCs w:val="32"/>
-          <w:lang w:val="uk-UA"/>
-        </w:rPr>
-      </w:pPr>
       <w:r>
         <w:rPr>
           <w:rtl w:val="0"/>
@@ -1602,80 +1585,20 @@
       <w:r>
         <w:rPr>
           <w:rFonts w:ascii="Times New Roman" w:hAnsi="Times New Roman" w:eastAsia="Times New Roman" w:cs="Times New Roman"/>
-          <w:b/>
-          <w:bCs/>
-          <w:sz w:val="32"/>
-          <w:szCs w:val="32"/>
-          <w:lang w:val="uk-UA"/>
-        </w:rPr>
-      </w:r>
-      <w:r>
-        <w:rPr>
-          <w:rFonts w:ascii="Times New Roman" w:hAnsi="Times New Roman" w:eastAsia="Times New Roman" w:cs="Times New Roman"/>
-          <w:b/>
-          <w:bCs/>
-          <w:sz w:val="32"/>
-          <w:szCs w:val="32"/>
-          <w:lang w:val="uk-UA"/>
-        </w:rPr>
-      </w:r>
-    </w:p>
-    <w:p>
-      <w:pPr>
-        <w:pBdr/>
-        <w:spacing/>
-        <w:ind/>
-        <w:jc w:val="both"/>
-        <w:rPr>
-          <w:rFonts w:ascii="Times New Roman" w:hAnsi="Times New Roman" w:eastAsia="Times New Roman" w:cs="Times New Roman"/>
-          <w:lang w:val="uk-UA"/>
-        </w:rPr>
-      </w:pPr>
-      <w:r>
-        <w:rPr>
-          <w:rtl w:val="0"/>
-          <w:lang w:val="uk-UA" w:bidi="uk-UA"/>
-        </w:rPr>
-      </w:r>
-      <w:r>
-        <w:rPr>
-          <w:rFonts w:ascii="Times New Roman" w:hAnsi="Times New Roman" w:eastAsia="Times New Roman" w:cs="Times New Roman"/>
-          <w:lang w:val="uk-UA"/>
-        </w:rPr>
-      </w:r>
-      <w:r>
-        <w:rPr>
-          <w:rFonts w:ascii="Times New Roman" w:hAnsi="Times New Roman" w:eastAsia="Times New Roman" w:cs="Times New Roman"/>
-          <w:lang w:val="uk-UA"/>
-        </w:rPr>
-      </w:r>
-    </w:p>
-    <w:p>
-      <w:pPr>
-        <w:pBdr/>
-        <w:spacing/>
-        <w:ind/>
-        <w:jc w:val="both"/>
-        <w:rPr>
-          <w:rFonts w:ascii="Times New Roman" w:hAnsi="Times New Roman" w:eastAsia="Times New Roman" w:cs="Times New Roman"/>
-          <w:lang w:val="uk-UA"/>
-        </w:rPr>
-      </w:pPr>
-      <w:r>
-        <w:rPr>
-          <w:rtl w:val="0"/>
-          <w:lang w:val="uk-UA" w:bidi="uk-UA"/>
-        </w:rPr>
-      </w:r>
-      <w:r>
-        <w:rPr>
-          <w:rFonts w:ascii="Times New Roman" w:hAnsi="Times New Roman" w:eastAsia="Times New Roman" w:cs="Times New Roman"/>
-          <w:lang w:val="uk-UA"/>
-        </w:rPr>
-      </w:r>
-      <w:r>
-        <w:rPr>
-          <w:rFonts w:ascii="Times New Roman" w:hAnsi="Times New Roman" w:eastAsia="Times New Roman" w:cs="Times New Roman"/>
+          <w:lang w:val="uk-UA"/>
+        </w:rPr>
+      </w:r>
+      <w:r>
+        <w:rPr>
+          <w:rFonts w:ascii="Times New Roman" w:hAnsi="Times New Roman" w:eastAsia="Times New Roman" w:cs="Times New Roman"/>
+          <w:lang w:val="uk-UA"/>
+        </w:rPr>
+      </w:r>
+      <w:r>
+        <w:rPr>
+          <w:rFonts w:ascii="Times New Roman" w:hAnsi="Times New Roman" w:eastAsia="Times New Roman" w:cs="Times New Roman"/>
+          <w:sz w:val="28"/>
+          <w:szCs w:val="28"/>
           <w:lang w:val="uk-UA"/>
         </w:rPr>
       </w:r>
@@ -9464,7 +9387,6 @@
                       </pic:nvPicPr>
                       <pic:blipFill rotWithShape="1">
                         <a:blip r:embed="rId23"/>
-                        <a:stretch/>
                       </pic:blipFill>
                       <pic:spPr bwMode="auto">
                         <a:xfrm flipH="0" flipV="0">
@@ -16380,7 +16302,27 @@
           <w:highlight w:val="none"/>
           <w:lang w:val="uk-UA" w:bidi="uk-UA"/>
         </w:rPr>
-        <w:t xml:space="preserve">  if (num == 'n' || special == 'n') {</w:t>
+        <w:t xml:space="preserve">  if (num == 'n' </w:t>
+      </w:r>
+      <w:r>
+        <w:rPr>
+          <w:rFonts w:ascii="JetBrainsMono NF" w:hAnsi="JetBrainsMono NF" w:eastAsia="JetBrainsMono NF" w:cs="JetBrainsMono NF"/>
+          <w:sz w:val="16"/>
+          <w:szCs w:val="16"/>
+          <w:highlight w:val="none"/>
+          <w:lang w:val="en-US"/>
+        </w:rPr>
+        <w:t xml:space="preserve">&amp;&amp;</w:t>
+      </w:r>
+      <w:r>
+        <w:rPr>
+          <w:rFonts w:ascii="JetBrainsMono NF" w:hAnsi="JetBrainsMono NF" w:eastAsia="JetBrainsMono NF" w:cs="JetBrainsMono NF"/>
+          <w:sz w:val="16"/>
+          <w:szCs w:val="16"/>
+          <w:highlight w:val="none"/>
+          <w:lang w:val="uk-UA" w:bidi="uk-UA"/>
+        </w:rPr>
+        <w:t xml:space="preserve"> special == 'n') {</w:t>
       </w:r>
       <w:r/>
     </w:p>

</xml_diff>